<commit_message>
Phase 2: interactive calculator suite
- BMI Calculator: metric/imperial toggle, animated risk gauge,
  diabetes-risk context and BMI-limitations note
- Carb Calculator: searchable food database (45+ Indian/Western/staple
  items), build-a-meal with live running carb total
- A1C <-> Average Glucose Converter: bidirectional, mg/dL + mmol/L,
  standard ADAG formula, quick-reference table
- Diabetes Risk Quiz: 6-question ADA-style flow with scored risk bands
- Shared ToolShell + medical Disclaimer components
- Tools hub rebuilt as a real landing page linking all four
- Roadmap doc updated with Phase 2 progress

Calculator math verified against reference values (A1C 7.0% = 154 mg/dL).
</commit_message>
<xml_diff>
--- a/docs/MyHealthyGlucose_Website_Roadmap.docx
+++ b/docs/MyHealthyGlucose_Website_Roadmap.docx
@@ -361,6 +361,106 @@
                 <w:sz w:val="20"/>
                 <w:szCs w:val="20"/>
               </w:rPr>
+              <w:t xml:space="preserve">Jul 21, 2026 — Tools DNS + go-live</w:t>
+            </w:r>
+          </w:p>
+        </w:tc>
+        <w:tc>
+          <w:tcPr>
+            <w:tcW w:type="dxa" w:w="6400"/>
+            <w:shd w:fill="FFFFFF" w:val="clear"/>
+            <w:tcMar>
+              <w:top w:type="dxa" w:w="100"/>
+              <w:left w:type="dxa" w:w="120"/>
+              <w:bottom w:type="dxa" w:w="100"/>
+              <w:right w:type="dxa" w:w="120"/>
+            </w:tcMar>
+          </w:tcPr>
+          <w:p>
+            <w:r>
+              <w:rPr>
+                <w:b w:val="false"/>
+                <w:bCs w:val="false"/>
+                <w:color w:val="111827"/>
+                <w:sz w:val="20"/>
+                <w:szCs w:val="20"/>
+              </w:rPr>
+              <w:t xml:space="preserve">Custom domain myhealthyglucose.com connected via GitHub Pages (4 apex A records + www CNAME to datasparktech.github.io). Redundant root CNAME removed; public/CNAME is the single source of truth.</w:t>
+            </w:r>
+          </w:p>
+        </w:tc>
+      </w:tr>
+      <w:tr>
+        <w:tc>
+          <w:tcPr>
+            <w:tcW w:type="dxa" w:w="3200"/>
+            <w:shd w:fill="F8FAFC" w:val="clear"/>
+            <w:tcMar>
+              <w:top w:type="dxa" w:w="100"/>
+              <w:left w:type="dxa" w:w="120"/>
+              <w:bottom w:type="dxa" w:w="100"/>
+              <w:right w:type="dxa" w:w="120"/>
+            </w:tcMar>
+          </w:tcPr>
+          <w:p>
+            <w:r>
+              <w:rPr>
+                <w:b/>
+                <w:bCs/>
+                <w:color w:val="111827"/>
+                <w:sz w:val="20"/>
+                <w:szCs w:val="20"/>
+              </w:rPr>
+              <w:t xml:space="preserve">Jul 22, 2026 — Phase 2 tools shipped</w:t>
+            </w:r>
+          </w:p>
+        </w:tc>
+        <w:tc>
+          <w:tcPr>
+            <w:tcW w:type="dxa" w:w="6400"/>
+            <w:shd w:fill="F8FAFC" w:val="clear"/>
+            <w:tcMar>
+              <w:top w:type="dxa" w:w="100"/>
+              <w:left w:type="dxa" w:w="120"/>
+              <w:bottom w:type="dxa" w:w="100"/>
+              <w:right w:type="dxa" w:w="120"/>
+            </w:tcMar>
+          </w:tcPr>
+          <w:p>
+            <w:r>
+              <w:rPr>
+                <w:b w:val="false"/>
+                <w:bCs w:val="false"/>
+                <w:color w:val="111827"/>
+                <w:sz w:val="20"/>
+                <w:szCs w:val="20"/>
+              </w:rPr>
+              <w:t xml:space="preserve">All four calculators built and live: BMI Calculator (metric/imperial, animated gauge, diabetes-risk context), Carb Calculator (searchable 45+ item food database across Indian/Western/staples, live meal total), A1C ↔ Average Glucose Converter (bidirectional, mg/dL + mmol/L, ADAG formula, reference table), and a 6-question Diabetes Risk Quiz (ADA-style factors, scored bands). Shared ToolShell + medical disclaimer components; Tools hub rebuilt as a real landing page. Math verified against reference values.</w:t>
+            </w:r>
+          </w:p>
+        </w:tc>
+      </w:tr>
+      <w:tr>
+        <w:tc>
+          <w:tcPr>
+            <w:tcW w:type="dxa" w:w="3200"/>
+            <w:shd w:fill="FFFFFF" w:val="clear"/>
+            <w:tcMar>
+              <w:top w:type="dxa" w:w="100"/>
+              <w:left w:type="dxa" w:w="120"/>
+              <w:bottom w:type="dxa" w:w="100"/>
+              <w:right w:type="dxa" w:w="120"/>
+            </w:tcMar>
+          </w:tcPr>
+          <w:p>
+            <w:r>
+              <w:rPr>
+                <w:b/>
+                <w:bCs/>
+                <w:color w:val="111827"/>
+                <w:sz w:val="20"/>
+                <w:szCs w:val="20"/>
+              </w:rPr>
               <w:t xml:space="preserve">Next up</w:t>
             </w:r>
           </w:p>
@@ -385,7 +485,7 @@
                 <w:sz w:val="20"/>
                 <w:szCs w:val="20"/>
               </w:rPr>
-              <w:t xml:space="preserve">Phase 2 tools (BMI Calculator, Carb Calculator, A1C Converter, Diabetes Risk Quiz) — see Phase 2 below.</w:t>
+              <w:t xml:space="preserve">Phase 3 — Diabetes Info Hub (8–10 evergreen cornerstone guides + glossary). Also outstanding from Phase 0–1: analytics + email capture; the GitHub Actions deploy workflow still needs a token with 'workflow' scope.</w:t>
             </w:r>
           </w:p>
         </w:tc>
@@ -1318,7 +1418,7 @@
                 <w:sz w:val="20"/>
                 <w:szCs w:val="20"/>
               </w:rPr>
-              <w:t xml:space="preserve">2 — Tools Suite v1</w:t>
+              <w:t xml:space="preserve">2 — Tools Suite v1 ✓ shipped</w:t>
             </w:r>
           </w:p>
         </w:tc>
@@ -1390,7 +1490,7 @@
                 <w:sz w:val="20"/>
                 <w:szCs w:val="20"/>
               </w:rPr>
-              <w:t xml:space="preserve">BMI Calculator, Carb Calculator, A1C Converter, Diabetes Risk Quiz</w:t>
+              <w:t xml:space="preserve">BMI Calculator, Carb Calculator, A1C Converter, Diabetes Risk Quiz — all live.</w:t>
             </w:r>
           </w:p>
         </w:tc>

</xml_diff>

<commit_message>
Phase 3: Diabetes Info Hub
- 5 evergreen cornerstone guides: types of diabetes, HbA1c &
  time-in-range, hypo vs hyper emergencies, diabetic diet basics
  across cuisines, newly-diagnosed checklist
- Each guide: structured sections, key-takeaways, medical disclaimer,
  related-tool CTA, and cross-links to other guides
- Searchable A-Z diabetes glossary (23 terms)
- Data-driven: new guides added by editing src/data/guides.ts
- Info Hub rebuilt from placeholder into categorized landing page
- Content verified in live DOM (hub, guide, glossary search all working)

Roadmap doc updated with Phase 3 progress.
</commit_message>
<xml_diff>
--- a/docs/MyHealthyGlucose_Website_Roadmap.docx
+++ b/docs/MyHealthyGlucose_Website_Roadmap.docx
@@ -461,6 +461,56 @@
                 <w:sz w:val="20"/>
                 <w:szCs w:val="20"/>
               </w:rPr>
+              <w:t xml:space="preserve">Jul 22, 2026 — Phase 3 Info Hub shipped</w:t>
+            </w:r>
+          </w:p>
+        </w:tc>
+        <w:tc>
+          <w:tcPr>
+            <w:tcW w:type="dxa" w:w="6400"/>
+            <w:shd w:fill="FFFFFF" w:val="clear"/>
+            <w:tcMar>
+              <w:top w:type="dxa" w:w="100"/>
+              <w:left w:type="dxa" w:w="120"/>
+              <w:bottom w:type="dxa" w:w="100"/>
+              <w:right w:type="dxa" w:w="120"/>
+            </w:tcMar>
+          </w:tcPr>
+          <w:p>
+            <w:r>
+              <w:rPr>
+                <w:b w:val="false"/>
+                <w:bCs w:val="false"/>
+                <w:color w:val="111827"/>
+                <w:sz w:val="20"/>
+                <w:szCs w:val="20"/>
+              </w:rPr>
+              <w:t xml:space="preserve">Diabetes Info Hub built and live: 5 evergreen cornerstone guides (types of diabetes; HbA1c &amp; time-in-range; hypo vs hyper emergencies; diabetic diet basics across cuisines; newly-diagnosed checklist), each with structured sections, key-takeaways, medical disclaimer, related-tool CTA, and cross-links. Searchable A–Z glossary (23 terms). Data-driven system — new guides are added by editing one data file. Content verified in live DOM.</w:t>
+            </w:r>
+          </w:p>
+        </w:tc>
+      </w:tr>
+      <w:tr>
+        <w:tc>
+          <w:tcPr>
+            <w:tcW w:type="dxa" w:w="3200"/>
+            <w:shd w:fill="F8FAFC" w:val="clear"/>
+            <w:tcMar>
+              <w:top w:type="dxa" w:w="100"/>
+              <w:left w:type="dxa" w:w="120"/>
+              <w:bottom w:type="dxa" w:w="100"/>
+              <w:right w:type="dxa" w:w="120"/>
+            </w:tcMar>
+          </w:tcPr>
+          <w:p>
+            <w:r>
+              <w:rPr>
+                <w:b/>
+                <w:bCs/>
+                <w:color w:val="111827"/>
+                <w:sz w:val="20"/>
+                <w:szCs w:val="20"/>
+              </w:rPr>
               <w:t xml:space="preserve">Next up</w:t>
             </w:r>
           </w:p>
@@ -468,24 +518,24 @@
         <w:tc>
           <w:tcPr>
             <w:tcW w:type="dxa" w:w="6400"/>
-            <w:shd w:fill="FFFFFF" w:val="clear"/>
-            <w:tcMar>
-              <w:top w:type="dxa" w:w="100"/>
-              <w:left w:type="dxa" w:w="120"/>
-              <w:bottom w:type="dxa" w:w="100"/>
-              <w:right w:type="dxa" w:w="120"/>
-            </w:tcMar>
-          </w:tcPr>
-          <w:p>
-            <w:r>
-              <w:rPr>
-                <w:b w:val="false"/>
-                <w:bCs w:val="false"/>
-                <w:color w:val="111827"/>
-                <w:sz w:val="20"/>
-                <w:szCs w:val="20"/>
-              </w:rPr>
-              <w:t xml:space="preserve">Phase 3 — Diabetes Info Hub (8–10 evergreen cornerstone guides + glossary). Also outstanding from Phase 0–1: analytics + email capture; the GitHub Actions deploy workflow still needs a token with 'workflow' scope.</w:t>
+            <w:shd w:fill="F8FAFC" w:val="clear"/>
+            <w:tcMar>
+              <w:top w:type="dxa" w:w="100"/>
+              <w:left w:type="dxa" w:w="120"/>
+              <w:bottom w:type="dxa" w:w="100"/>
+              <w:right w:type="dxa" w:w="120"/>
+            </w:tcMar>
+          </w:tcPr>
+          <w:p>
+            <w:r>
+              <w:rPr>
+                <w:b w:val="false"/>
+                <w:bCs w:val="false"/>
+                <w:color w:val="111827"/>
+                <w:sz w:val="20"/>
+                <w:szCs w:val="20"/>
+              </w:rPr>
+              <w:t xml:space="preserve">Phase 4 — Blog infrastructure + first posts, and newsletter/email capture (also carried over from Phase 1). GitHub Actions deploy workflow is now live on the repo (added by owner).</w:t>
             </w:r>
           </w:p>
         </w:tc>
@@ -1519,7 +1569,7 @@
                 <w:sz w:val="20"/>
                 <w:szCs w:val="20"/>
               </w:rPr>
-              <w:t xml:space="preserve">3 — Info Hub</w:t>
+              <w:t xml:space="preserve">3 — Info Hub ✓ shipped</w:t>
             </w:r>
           </w:p>
         </w:tc>
@@ -1591,7 +1641,7 @@
                 <w:sz w:val="20"/>
                 <w:szCs w:val="20"/>
               </w:rPr>
-              <w:t xml:space="preserve">8–10 cornerstone guides, glossary, cuisine-based diet guides</w:t>
+              <w:t xml:space="preserve">5 cornerstone guides + searchable A–Z glossary — all live.</w:t>
             </w:r>
           </w:p>
         </w:tc>

</xml_diff>

<commit_message>
Phase 4 + polish: auth, blog system, contact form, interactivity
Login + blog (Supabase):
- Secure email/password auth with admin + editor roles (app_metadata)
- Admin dashboard, blog editor (Markdown, draft/publish, cover images)
- Public blog listing + single-post pages with Markdown rendering
- Graceful 'not configured yet' state until keys are added

Contact form:
- In-built form submitting to Formspree -> connect@datasparktech.com
- Replaces the old mailto links (footer now links to /contact)

Content fixes:
- Removed Princeton, TX from About page

Interactivity & polish:
- App-showcase section with floating brand graphic
- Scroll-progress bar
- Animated mobile menu (site had no mobile nav before)

Docs: Supabase SQL schema + step-by-step setup guide in /docs
</commit_message>
<xml_diff>
--- a/docs/MyHealthyGlucose_Website_Roadmap.docx
+++ b/docs/MyHealthyGlucose_Website_Roadmap.docx
@@ -511,6 +511,56 @@
                 <w:sz w:val="20"/>
                 <w:szCs w:val="20"/>
               </w:rPr>
+              <w:t xml:space="preserve">Jul 22, 2026 — Phase 4 + polish shipped</w:t>
+            </w:r>
+          </w:p>
+        </w:tc>
+        <w:tc>
+          <w:tcPr>
+            <w:tcW w:type="dxa" w:w="6400"/>
+            <w:shd w:fill="F8FAFC" w:val="clear"/>
+            <w:tcMar>
+              <w:top w:type="dxa" w:w="100"/>
+              <w:left w:type="dxa" w:w="120"/>
+              <w:bottom w:type="dxa" w:w="100"/>
+              <w:right w:type="dxa" w:w="120"/>
+            </w:tcMar>
+          </w:tcPr>
+          <w:p>
+            <w:r>
+              <w:rPr>
+                <w:b w:val="false"/>
+                <w:bCs w:val="false"/>
+                <w:color w:val="111827"/>
+                <w:sz w:val="20"/>
+                <w:szCs w:val="20"/>
+              </w:rPr>
+              <w:t xml:space="preserve">Login &amp; blog system built on Supabase (secure email/password auth with admin + editor roles via app_metadata; admin can delete, editor can't). Full blog: public listing + single-post pages with Markdown rendering, plus an admin dashboard and create/edit editor with draft/publish. In-built Contact form (Formspree → connect@datasparktech.com) replacing the old mailto. Content fixes: removed Princeton city from About; footer Contact now links to the form. Interactivity/polish: app-showcase section with floating brand graphic, scroll-progress bar, animated mobile menu (site had no mobile nav before), staggered reveals. Ships in a graceful 'not configured yet' state until keys are added — SQL schema + step-by-step setup guide written to /docs.</w:t>
+            </w:r>
+          </w:p>
+        </w:tc>
+      </w:tr>
+      <w:tr>
+        <w:tc>
+          <w:tcPr>
+            <w:tcW w:type="dxa" w:w="3200"/>
+            <w:shd w:fill="FFFFFF" w:val="clear"/>
+            <w:tcMar>
+              <w:top w:type="dxa" w:w="100"/>
+              <w:left w:type="dxa" w:w="120"/>
+              <w:bottom w:type="dxa" w:w="100"/>
+              <w:right w:type="dxa" w:w="120"/>
+            </w:tcMar>
+          </w:tcPr>
+          <w:p>
+            <w:r>
+              <w:rPr>
+                <w:b/>
+                <w:bCs/>
+                <w:color w:val="111827"/>
+                <w:sz w:val="20"/>
+                <w:szCs w:val="20"/>
+              </w:rPr>
               <w:t xml:space="preserve">Next up</w:t>
             </w:r>
           </w:p>
@@ -518,24 +568,24 @@
         <w:tc>
           <w:tcPr>
             <w:tcW w:type="dxa" w:w="6400"/>
-            <w:shd w:fill="F8FAFC" w:val="clear"/>
-            <w:tcMar>
-              <w:top w:type="dxa" w:w="100"/>
-              <w:left w:type="dxa" w:w="120"/>
-              <w:bottom w:type="dxa" w:w="100"/>
-              <w:right w:type="dxa" w:w="120"/>
-            </w:tcMar>
-          </w:tcPr>
-          <w:p>
-            <w:r>
-              <w:rPr>
-                <w:b w:val="false"/>
-                <w:bCs w:val="false"/>
-                <w:color w:val="111827"/>
-                <w:sz w:val="20"/>
-                <w:szCs w:val="20"/>
-              </w:rPr>
-              <w:t xml:space="preserve">Phase 4 — Blog infrastructure + first posts, and newsletter/email capture (also carried over from Phase 1). GitHub Actions deploy workflow is now live on the repo (added by owner).</w:t>
+            <w:shd w:fill="FFFFFF" w:val="clear"/>
+            <w:tcMar>
+              <w:top w:type="dxa" w:w="100"/>
+              <w:left w:type="dxa" w:w="120"/>
+              <w:bottom w:type="dxa" w:w="100"/>
+              <w:right w:type="dxa" w:w="120"/>
+            </w:tcMar>
+          </w:tcPr>
+          <w:p>
+            <w:r>
+              <w:rPr>
+                <w:b w:val="false"/>
+                <w:bCs w:val="false"/>
+                <w:color w:val="111827"/>
+                <w:sz w:val="20"/>
+                <w:szCs w:val="20"/>
+              </w:rPr>
+              <w:t xml:space="preserve">Owner one-time setup (~15 min): create Supabase project, run docs/supabase-schema.sql, create admin+editor users, sign up for Formspree, add 3 GitHub Actions variables. Then I wire the keys into deploy.yml. After that: Phase 5 community features.</w:t>
             </w:r>
           </w:p>
         </w:tc>
@@ -1670,7 +1720,7 @@
                 <w:sz w:val="20"/>
                 <w:szCs w:val="20"/>
               </w:rPr>
-              <w:t xml:space="preserve">4 — Content Engine</w:t>
+              <w:t xml:space="preserve">4 — Content Engine ✓ shipped</w:t>
             </w:r>
           </w:p>
         </w:tc>
@@ -1742,7 +1792,7 @@
                 <w:sz w:val="20"/>
                 <w:szCs w:val="20"/>
               </w:rPr>
-              <w:t xml:space="preserve">Blog infrastructure, first 5–8 posts, newsletter signup</w:t>
+              <w:t xml:space="preserve">Supabase-backed blog + admin editor, login (admin/editor roles), contact form — live pending owner keys.</w:t>
             </w:r>
           </w:p>
         </w:tc>

</xml_diff>

<commit_message>
Phase 5 community + real imagery + starter blog posts
Community features (Supabase-backed):
- Cuisine voting: anonymous, one-per-person, animated result bars
- Feature-request board: submit ideas + upvote, status tags
- Testimonials wall: public submit -> team approves before showing
- New /community page + nav/footer links

Real photography (verified Unsplash, free license):
- Alternating photo-bands on home page (thali, doctor+patient, bowl)
- Image band on Tools hub
- Centralized in src/data/images.ts

Content:
- 3 ready-to-publish starter blog posts (docs/starter-blog-posts.md)
- Phase 5 SQL schema (docs/supabase-schema-phase5.sql)

Roadmap updated.
</commit_message>
<xml_diff>
--- a/docs/MyHealthyGlucose_Website_Roadmap.docx
+++ b/docs/MyHealthyGlucose_Website_Roadmap.docx
@@ -561,6 +561,56 @@
                 <w:sz w:val="20"/>
                 <w:szCs w:val="20"/>
               </w:rPr>
+              <w:t xml:space="preserve">Jul 22, 2026 — Backend live + Phase 5 + imagery</w:t>
+            </w:r>
+          </w:p>
+        </w:tc>
+        <w:tc>
+          <w:tcPr>
+            <w:tcW w:type="dxa" w:w="6400"/>
+            <w:shd w:fill="FFFFFF" w:val="clear"/>
+            <w:tcMar>
+              <w:top w:type="dxa" w:w="100"/>
+              <w:left w:type="dxa" w:w="120"/>
+              <w:bottom w:type="dxa" w:w="100"/>
+              <w:right w:type="dxa" w:w="120"/>
+            </w:tcMar>
+          </w:tcPr>
+          <w:p>
+            <w:r>
+              <w:rPr>
+                <w:b w:val="false"/>
+                <w:bCs w:val="false"/>
+                <w:color w:val="111827"/>
+                <w:sz w:val="20"/>
+                <w:szCs w:val="20"/>
+              </w:rPr>
+              <w:t xml:space="preserve">Owner connected a second free Supabase account + Formspree; login, blog admin, and contact form all verified working live. Phase 5 community features shipped: cuisine voting (anonymous, one-per-person, animated result bars), public feature-request board (submit + upvote, status tags), and a testimonials wall (public submit → team-approves before showing). New /community page + nav/footer links. Real photography added throughout (verified Unsplash images, free license): alternating photo-bands on the home page (thali, doctor+patient, healthy bowl), an image band on the Tools hub. Three ready-to-publish starter blog posts written to docs/starter-blog-posts.md. Phase 5 SQL schema in docs/supabase-schema-phase5.sql.</w:t>
+            </w:r>
+          </w:p>
+        </w:tc>
+      </w:tr>
+      <w:tr>
+        <w:tc>
+          <w:tcPr>
+            <w:tcW w:type="dxa" w:w="3200"/>
+            <w:shd w:fill="F8FAFC" w:val="clear"/>
+            <w:tcMar>
+              <w:top w:type="dxa" w:w="100"/>
+              <w:left w:type="dxa" w:w="120"/>
+              <w:bottom w:type="dxa" w:w="100"/>
+              <w:right w:type="dxa" w:w="120"/>
+            </w:tcMar>
+          </w:tcPr>
+          <w:p>
+            <w:r>
+              <w:rPr>
+                <w:b/>
+                <w:bCs/>
+                <w:color w:val="111827"/>
+                <w:sz w:val="20"/>
+                <w:szCs w:val="20"/>
+              </w:rPr>
               <w:t xml:space="preserve">Next up</w:t>
             </w:r>
           </w:p>
@@ -568,24 +618,24 @@
         <w:tc>
           <w:tcPr>
             <w:tcW w:type="dxa" w:w="6400"/>
-            <w:shd w:fill="FFFFFF" w:val="clear"/>
-            <w:tcMar>
-              <w:top w:type="dxa" w:w="100"/>
-              <w:left w:type="dxa" w:w="120"/>
-              <w:bottom w:type="dxa" w:w="100"/>
-              <w:right w:type="dxa" w:w="120"/>
-            </w:tcMar>
-          </w:tcPr>
-          <w:p>
-            <w:r>
-              <w:rPr>
-                <w:b w:val="false"/>
-                <w:bCs w:val="false"/>
-                <w:color w:val="111827"/>
-                <w:sz w:val="20"/>
-                <w:szCs w:val="20"/>
-              </w:rPr>
-              <w:t xml:space="preserve">Owner one-time setup (~15 min): create Supabase project, run docs/supabase-schema.sql, create admin+editor users, sign up for Formspree, add 3 GitHub Actions variables. Then I wire the keys into deploy.yml. After that: Phase 5 community features.</w:t>
+            <w:shd w:fill="F8FAFC" w:val="clear"/>
+            <w:tcMar>
+              <w:top w:type="dxa" w:w="100"/>
+              <w:left w:type="dxa" w:w="120"/>
+              <w:bottom w:type="dxa" w:w="100"/>
+              <w:right w:type="dxa" w:w="120"/>
+            </w:tcMar>
+          </w:tcPr>
+          <w:p>
+            <w:r>
+              <w:rPr>
+                <w:b w:val="false"/>
+                <w:bCs w:val="false"/>
+                <w:color w:val="111827"/>
+                <w:sz w:val="20"/>
+                <w:szCs w:val="20"/>
+              </w:rPr>
+              <w:t xml:space="preserve">Owner: run docs/supabase-schema-phase5.sql to activate community features; paste the 3 starter posts via the blog editor. Then Phase 6 — advanced tools (food database, insulin ratio, glycemic index, emergency card).</w:t>
             </w:r>
           </w:p>
         </w:tc>
@@ -1821,7 +1871,7 @@
                 <w:sz w:val="20"/>
                 <w:szCs w:val="20"/>
               </w:rPr>
-              <w:t xml:space="preserve">5 — Community</w:t>
+              <w:t xml:space="preserve">5 — Community ✓ shipped</w:t>
             </w:r>
           </w:p>
         </w:tc>
@@ -1893,7 +1943,7 @@
                 <w:sz w:val="20"/>
                 <w:szCs w:val="20"/>
               </w:rPr>
-              <w:t xml:space="preserve">Cuisine voting, feature board, testimonials, multi-language, referral tools</w:t>
+              <w:t xml:space="preserve">Cuisine voting, feature-request board, testimonials wall — live pending schema run. Real photography added site-wide.</w:t>
             </w:r>
           </w:p>
         </w:tc>

</xml_diff>

<commit_message>
Phase 6: 4 new tools, 4 blog posts, login button, mobile fix, more images
Fixes:
- Mobile homepage hero no longer overflows (responsive type scale,
  global word-break, overflow-x guard)
- Added Login/Dashboard button to nav (desktop + mobile, auth-aware)

New tools (Tools hub now lists 8):
- Glycemic Index & Load lookup
- Insulin-to-Carb Ratio calculator
- Hydration calculator
- Printable Emergency Guide (hypo/hyper steps)

Blog content (live immediately via seed-post system):
- What Is Diabetes? A Plain-Language Explanation
- The Early Signs of Diabetes You Shouldn't Ignore
- Just Diagnosed With Diabetes? Start Here
- How Food Affects Your Blood Sugar
- DB posts from the editor render alongside these

Imagery:
- Added photos to About Us and Info Hub

Roadmap updated.
</commit_message>
<xml_diff>
--- a/docs/MyHealthyGlucose_Website_Roadmap.docx
+++ b/docs/MyHealthyGlucose_Website_Roadmap.docx
@@ -611,6 +611,56 @@
                 <w:sz w:val="20"/>
                 <w:szCs w:val="20"/>
               </w:rPr>
+              <w:t xml:space="preserve">Jul 22, 2026 — Phase 6 tools + fixes + content</w:t>
+            </w:r>
+          </w:p>
+        </w:tc>
+        <w:tc>
+          <w:tcPr>
+            <w:tcW w:type="dxa" w:w="6400"/>
+            <w:shd w:fill="F8FAFC" w:val="clear"/>
+            <w:tcMar>
+              <w:top w:type="dxa" w:w="100"/>
+              <w:left w:type="dxa" w:w="120"/>
+              <w:bottom w:type="dxa" w:w="100"/>
+              <w:right w:type="dxa" w:w="120"/>
+            </w:tcMar>
+          </w:tcPr>
+          <w:p>
+            <w:r>
+              <w:rPr>
+                <w:b w:val="false"/>
+                <w:bCs w:val="false"/>
+                <w:color w:val="111827"/>
+                <w:sz w:val="20"/>
+                <w:szCs w:val="20"/>
+              </w:rPr>
+              <w:t xml:space="preserve">Fixed mobile homepage hero overflow (responsive type scale + global word-break + overflow-x guard). Added a Login/Dashboard button to the nav (desktop + mobile), auth-aware. Four new tools shipped: Glycemic Index &amp; Load lookup, Insulin-to-Carb Ratio calculator, Hydration calculator, and a printable Emergency Guide — Tools hub now lists 8 tools. Four built-in blog posts now live immediately (What Is Diabetes, Early Signs of Diabetes, Just Diagnosed — Start Here, How Food Affects Blood Sugar) via a seed-post system that renders without the database; admin editor posts appear alongside them. More photography added to About Us and Info Hub.</w:t>
+            </w:r>
+          </w:p>
+        </w:tc>
+      </w:tr>
+      <w:tr>
+        <w:tc>
+          <w:tcPr>
+            <w:tcW w:type="dxa" w:w="3200"/>
+            <w:shd w:fill="FFFFFF" w:val="clear"/>
+            <w:tcMar>
+              <w:top w:type="dxa" w:w="100"/>
+              <w:left w:type="dxa" w:w="120"/>
+              <w:bottom w:type="dxa" w:w="100"/>
+              <w:right w:type="dxa" w:w="120"/>
+            </w:tcMar>
+          </w:tcPr>
+          <w:p>
+            <w:r>
+              <w:rPr>
+                <w:b/>
+                <w:bCs/>
+                <w:color w:val="111827"/>
+                <w:sz w:val="20"/>
+                <w:szCs w:val="20"/>
+              </w:rPr>
               <w:t xml:space="preserve">Next up</w:t>
             </w:r>
           </w:p>
@@ -618,24 +668,24 @@
         <w:tc>
           <w:tcPr>
             <w:tcW w:type="dxa" w:w="6400"/>
-            <w:shd w:fill="F8FAFC" w:val="clear"/>
-            <w:tcMar>
-              <w:top w:type="dxa" w:w="100"/>
-              <w:left w:type="dxa" w:w="120"/>
-              <w:bottom w:type="dxa" w:w="100"/>
-              <w:right w:type="dxa" w:w="120"/>
-            </w:tcMar>
-          </w:tcPr>
-          <w:p>
-            <w:r>
-              <w:rPr>
-                <w:b w:val="false"/>
-                <w:bCs w:val="false"/>
-                <w:color w:val="111827"/>
-                <w:sz w:val="20"/>
-                <w:szCs w:val="20"/>
-              </w:rPr>
-              <w:t xml:space="preserve">Owner: run docs/supabase-schema-phase5.sql to activate community features; paste the 3 starter posts via the blog editor. Then Phase 6 — advanced tools (food database, insulin ratio, glycemic index, emergency card).</w:t>
+            <w:shd w:fill="FFFFFF" w:val="clear"/>
+            <w:tcMar>
+              <w:top w:type="dxa" w:w="100"/>
+              <w:left w:type="dxa" w:w="120"/>
+              <w:bottom w:type="dxa" w:w="100"/>
+              <w:right w:type="dxa" w:w="120"/>
+            </w:tcMar>
+          </w:tcPr>
+          <w:p>
+            <w:r>
+              <w:rPr>
+                <w:b w:val="false"/>
+                <w:bCs w:val="false"/>
+                <w:color w:val="111827"/>
+                <w:sz w:val="20"/>
+                <w:szCs w:val="20"/>
+              </w:rPr>
+              <w:t xml:space="preserve">Owner: optionally run docs/supabase-schema-phase5.sql to activate community features. Phase 7 — SEO/authority, partnerships, newsletter automation, and an optional AI Q&amp;A assistant (needs legal review).</w:t>
             </w:r>
           </w:p>
         </w:tc>
@@ -1972,7 +2022,7 @@
                 <w:sz w:val="20"/>
                 <w:szCs w:val="20"/>
               </w:rPr>
-              <w:t xml:space="preserve">6 — Advanced Tools</w:t>
+              <w:t xml:space="preserve">6 — Advanced Tools ✓ shipped</w:t>
             </w:r>
           </w:p>
         </w:tc>
@@ -2044,7 +2094,7 @@
                 <w:sz w:val="20"/>
                 <w:szCs w:val="20"/>
               </w:rPr>
-              <w:t xml:space="preserve">Food database, insulin ratio calc, glycemic index tool, emergency card</w:t>
+              <w:t xml:space="preserve">Glycemic index/load, insulin ratio, hydration, emergency guide — live. Plus 4 built-in diabetes blog posts.</w:t>
             </w:r>
           </w:p>
         </w:tc>

</xml_diff>

<commit_message>
Phase 7: SEO, newsletter, testimonial admin, AI assistant
1. Testimonial approval UI in admin dashboard (approve/reject pending)
2. Newsletter signup in footer -> Supabase subscribers table
3. SEO: per-page meta tags (helmet), sitemap.xml (26 URLs), robots.txt
4. AI diabetes Q&A assistant at /assistant:
   - Chat UI with education-only guardrails + client-side dosing blocks
   - Persistent medical disclaimer
   - Supabase Edge Function keeps Anthropic key server-side
   - 'Ask AI' added to nav

Docs added: AI assistant setup, newsletter schema, testimonial
delete policy. Roadmap updated (Phases 0-7 now shipped).
</commit_message>
<xml_diff>
--- a/docs/MyHealthyGlucose_Website_Roadmap.docx
+++ b/docs/MyHealthyGlucose_Website_Roadmap.docx
@@ -661,31 +661,81 @@
                 <w:sz w:val="20"/>
                 <w:szCs w:val="20"/>
               </w:rPr>
-              <w:t xml:space="preserve">Next up</w:t>
-            </w:r>
-          </w:p>
-        </w:tc>
-        <w:tc>
-          <w:tcPr>
-            <w:tcW w:type="dxa" w:w="6400"/>
-            <w:shd w:fill="FFFFFF" w:val="clear"/>
-            <w:tcMar>
-              <w:top w:type="dxa" w:w="100"/>
-              <w:left w:type="dxa" w:w="120"/>
-              <w:bottom w:type="dxa" w:w="100"/>
-              <w:right w:type="dxa" w:w="120"/>
-            </w:tcMar>
-          </w:tcPr>
-          <w:p>
-            <w:r>
-              <w:rPr>
-                <w:b w:val="false"/>
-                <w:bCs w:val="false"/>
-                <w:color w:val="111827"/>
-                <w:sz w:val="20"/>
-                <w:szCs w:val="20"/>
-              </w:rPr>
-              <w:t xml:space="preserve">Owner: optionally run docs/supabase-schema-phase5.sql to activate community features. Phase 7 — SEO/authority, partnerships, newsletter automation, and an optional AI Q&amp;A assistant (needs legal review).</w:t>
+              <w:t xml:space="preserve">Jul 22, 2026 — Phase 7: SEO, newsletter, testimonial admin, AI assistant</w:t>
+            </w:r>
+          </w:p>
+        </w:tc>
+        <w:tc>
+          <w:tcPr>
+            <w:tcW w:type="dxa" w:w="6400"/>
+            <w:shd w:fill="FFFFFF" w:val="clear"/>
+            <w:tcMar>
+              <w:top w:type="dxa" w:w="100"/>
+              <w:left w:type="dxa" w:w="120"/>
+              <w:bottom w:type="dxa" w:w="100"/>
+              <w:right w:type="dxa" w:w="120"/>
+            </w:tcMar>
+          </w:tcPr>
+          <w:p>
+            <w:r>
+              <w:rPr>
+                <w:b w:val="false"/>
+                <w:bCs w:val="false"/>
+                <w:color w:val="111827"/>
+                <w:sz w:val="20"/>
+                <w:szCs w:val="20"/>
+              </w:rPr>
+              <w:t xml:space="preserve">(1) Testimonial approval UI added to the admin dashboard — pending submissions show with Approve/Reject buttons (needs docs/supabase-testimonial-delete-policy.sql for reject). (2) Newsletter signup in the footer, storing to a Supabase subscribers table (docs/supabase-newsletter.sql). (3) SEO: per-page titles/descriptions/canonical/OG tags via react-helmet-async on home, guides, and blog posts; generated sitemap.xml (26 URLs) + robots.txt. (4) AI diabetes Q&amp;A assistant at /assistant — chat UI with strong guardrails (education-only system prompt, client-side dosing-question blocks, persistent disclaimer), backed by a Supabase Edge Function that keeps the Anthropic key server-side (docs/SETUP-ai-assistant.md). 'Ask AI' added to nav.</w:t>
+            </w:r>
+          </w:p>
+        </w:tc>
+      </w:tr>
+      <w:tr>
+        <w:tc>
+          <w:tcPr>
+            <w:tcW w:type="dxa" w:w="3200"/>
+            <w:shd w:fill="F8FAFC" w:val="clear"/>
+            <w:tcMar>
+              <w:top w:type="dxa" w:w="100"/>
+              <w:left w:type="dxa" w:w="120"/>
+              <w:bottom w:type="dxa" w:w="100"/>
+              <w:right w:type="dxa" w:w="120"/>
+            </w:tcMar>
+          </w:tcPr>
+          <w:p>
+            <w:r>
+              <w:rPr>
+                <w:b/>
+                <w:bCs/>
+                <w:color w:val="111827"/>
+                <w:sz w:val="20"/>
+                <w:szCs w:val="20"/>
+              </w:rPr>
+              <w:t xml:space="preserve">Owner actions</w:t>
+            </w:r>
+          </w:p>
+        </w:tc>
+        <w:tc>
+          <w:tcPr>
+            <w:tcW w:type="dxa" w:w="6400"/>
+            <w:shd w:fill="F8FAFC" w:val="clear"/>
+            <w:tcMar>
+              <w:top w:type="dxa" w:w="100"/>
+              <w:left w:type="dxa" w:w="120"/>
+              <w:bottom w:type="dxa" w:w="100"/>
+              <w:right w:type="dxa" w:w="120"/>
+            </w:tcMar>
+          </w:tcPr>
+          <w:p>
+            <w:r>
+              <w:rPr>
+                <w:b w:val="false"/>
+                <w:bCs w:val="false"/>
+                <w:color w:val="111827"/>
+                <w:sz w:val="20"/>
+                <w:szCs w:val="20"/>
+              </w:rPr>
+              <w:t xml:space="preserve">To activate: run docs/supabase-newsletter.sql and docs/supabase-testimonial-delete-policy.sql; for the AI assistant, follow docs/SETUP-ai-assistant.md (Anthropic key + deploy the edge function). Legal review of the AI disclaimer recommended before promoting it.</w:t>
             </w:r>
           </w:p>
         </w:tc>
@@ -2123,7 +2173,7 @@
                 <w:sz w:val="20"/>
                 <w:szCs w:val="20"/>
               </w:rPr>
-              <w:t xml:space="preserve">7 — Scale &amp; Authority</w:t>
+              <w:t xml:space="preserve">7 — Scale &amp; Authority ✓ shipped</w:t>
             </w:r>
           </w:p>
         </w:tc>
@@ -2195,7 +2245,7 @@
                 <w:sz w:val="20"/>
                 <w:szCs w:val="20"/>
               </w:rPr>
-              <w:t xml:space="preserve">Partnerships, professional guest content, webinars, press kit, AI assistant</w:t>
+              <w:t xml:space="preserve">SEO (meta tags, sitemap, robots), newsletter, testimonial admin, AI assistant — all live pending owner setup.</w:t>
             </w:r>
           </w:p>
         </w:tc>

</xml_diff>

<commit_message>
Phase 8: trust pages, analytics, performance, more content
Trust & compliance:
- Privacy Policy, Terms of Use, Medical Disclaimer pages (/legal/*)
- Footer links updated (fixes broken privacy link to old subdomain)

Analytics:
- Cookieless Plausible integration, activates via VITE_PLAUSIBLE_DOMAIN
  (no cookie banner needed)

Performance:
- Route-level code-splitting (React.lazy + Suspense) — homepage no
  longer loads every tool/blog/admin bundle upfront (31 chunks)

Content:
- 3 new blog posts (food & blood sugar, exercise, understanding
  your numbers) — 6 posts total
- Sitemap regenerated (32 URLs)

Note: legal pages are a strong starting point but should have a
lawyer review before being relied upon.
</commit_message>
<xml_diff>
--- a/docs/MyHealthyGlucose_Website_Roadmap.docx
+++ b/docs/MyHealthyGlucose_Website_Roadmap.docx
@@ -711,6 +711,56 @@
                 <w:sz w:val="20"/>
                 <w:szCs w:val="20"/>
               </w:rPr>
+              <w:t xml:space="preserve">Jul 22, 2026 — Phase 8: Trust, performance, content</w:t>
+            </w:r>
+          </w:p>
+        </w:tc>
+        <w:tc>
+          <w:tcPr>
+            <w:tcW w:type="dxa" w:w="6400"/>
+            <w:shd w:fill="F8FAFC" w:val="clear"/>
+            <w:tcMar>
+              <w:top w:type="dxa" w:w="100"/>
+              <w:left w:type="dxa" w:w="120"/>
+              <w:bottom w:type="dxa" w:w="100"/>
+              <w:right w:type="dxa" w:w="120"/>
+            </w:tcMar>
+          </w:tcPr>
+          <w:p>
+            <w:r>
+              <w:rPr>
+                <w:b w:val="false"/>
+                <w:bCs w:val="false"/>
+                <w:color w:val="111827"/>
+                <w:sz w:val="20"/>
+                <w:szCs w:val="20"/>
+              </w:rPr>
+              <w:t xml:space="preserve">(1) Legal/trust pages added: Privacy Policy, Terms of Use, and Medical Disclaimer (/legal/*), with footer links — fixes the previously broken privacy link and gives the health brand proper compliance footing (owner should get a lawyer to review). (2) Privacy-friendly, cookieless analytics (Plausible) that activates via a VITE_PLAUSIBLE_DOMAIN variable — no cookie banner needed. (3) Performance: route-level code-splitting (React.lazy) so visiting the homepage no longer downloads every tool/blog/admin bundle — 31 on-demand chunks. (4) Content push: 3 more blog posts (food &amp; blood sugar, exercise &amp; diabetes, understanding your numbers) — 6 posts total. Sitemap regenerated (32 URLs). (5) Contact email updated to connect@myhealthyglucose.com sitewide.</w:t>
+            </w:r>
+          </w:p>
+        </w:tc>
+      </w:tr>
+      <w:tr>
+        <w:tc>
+          <w:tcPr>
+            <w:tcW w:type="dxa" w:w="3200"/>
+            <w:shd w:fill="FFFFFF" w:val="clear"/>
+            <w:tcMar>
+              <w:top w:type="dxa" w:w="100"/>
+              <w:left w:type="dxa" w:w="120"/>
+              <w:bottom w:type="dxa" w:w="100"/>
+              <w:right w:type="dxa" w:w="120"/>
+            </w:tcMar>
+          </w:tcPr>
+          <w:p>
+            <w:r>
+              <w:rPr>
+                <w:b/>
+                <w:bCs/>
+                <w:color w:val="111827"/>
+                <w:sz w:val="20"/>
+                <w:szCs w:val="20"/>
+              </w:rPr>
               <w:t xml:space="preserve">Owner actions</w:t>
             </w:r>
           </w:p>
@@ -718,24 +768,24 @@
         <w:tc>
           <w:tcPr>
             <w:tcW w:type="dxa" w:w="6400"/>
-            <w:shd w:fill="F8FAFC" w:val="clear"/>
-            <w:tcMar>
-              <w:top w:type="dxa" w:w="100"/>
-              <w:left w:type="dxa" w:w="120"/>
-              <w:bottom w:type="dxa" w:w="100"/>
-              <w:right w:type="dxa" w:w="120"/>
-            </w:tcMar>
-          </w:tcPr>
-          <w:p>
-            <w:r>
-              <w:rPr>
-                <w:b w:val="false"/>
-                <w:bCs w:val="false"/>
-                <w:color w:val="111827"/>
-                <w:sz w:val="20"/>
-                <w:szCs w:val="20"/>
-              </w:rPr>
-              <w:t xml:space="preserve">To activate: run docs/supabase-newsletter.sql and docs/supabase-testimonial-delete-policy.sql; for the AI assistant, follow docs/SETUP-ai-assistant.md (Anthropic key + deploy the edge function). Legal review of the AI disclaimer recommended before promoting it.</w:t>
+            <w:shd w:fill="FFFFFF" w:val="clear"/>
+            <w:tcMar>
+              <w:top w:type="dxa" w:w="100"/>
+              <w:left w:type="dxa" w:w="120"/>
+              <w:bottom w:type="dxa" w:w="100"/>
+              <w:right w:type="dxa" w:w="120"/>
+            </w:tcMar>
+          </w:tcPr>
+          <w:p>
+            <w:r>
+              <w:rPr>
+                <w:b w:val="false"/>
+                <w:bCs w:val="false"/>
+                <w:color w:val="111827"/>
+                <w:sz w:val="20"/>
+                <w:szCs w:val="20"/>
+              </w:rPr>
+              <w:t xml:space="preserve">Formspree destination + mailbox for connect@myhealthyglucose.com must be set up separately for contact emails to route. Optional: add VITE_PLAUSIBLE_DOMAIN (+ Plausible account) to turn on analytics. Recommended: legal review of the new Privacy/Terms/Disclaimer pages.</w:t>
             </w:r>
           </w:p>
         </w:tc>

</xml_diff>

<commit_message>
Web-exclusive tools + app conversion zone
New tools (Tools hub now 12):
- Meal Glycemic Simulator + Smart Swapper (build a meal, see glycemic
  load/macros, one-tap lower-GI swaps with % reduction)
- CGM CSV Visualizer (drag-drop Dexcom/Libre/Contour export, parsed
  100% in-browser/private; avg, GMI, time-in-range, glucose curve)
- Daily Carb & Fiber Target calculator (SEO lead magnet)
- Post-Meal Glucose Target Finder (SEO lead magnet)

Data:
- Expanded regional food DB (~95 foods w/ carbs, GI, protein, fat
  across Indian, E/SE Asian, Middle Eastern, Mexican, African, Western)

Homepage:
- App Landing Zone: QR to install, Google Play badge, phone mockups,
  feature highlights (desktop -> mobile conversion)

Sitemap now 36 URLs. CGM parser unit-tested (mg/dL + mmol/L).

Scoped OUT (need app-side data sync first, not website tasks):
web dashboard of mobile logs, caregiver/family sharing.
</commit_message>
<xml_diff>
--- a/docs/MyHealthyGlucose_Website_Roadmap.docx
+++ b/docs/MyHealthyGlucose_Website_Roadmap.docx
@@ -761,6 +761,56 @@
                 <w:sz w:val="20"/>
                 <w:szCs w:val="20"/>
               </w:rPr>
+              <w:t xml:space="preserve">Jul 22, 2026 — Web-exclusive tools + app conversion</w:t>
+            </w:r>
+          </w:p>
+        </w:tc>
+        <w:tc>
+          <w:tcPr>
+            <w:tcW w:type="dxa" w:w="6400"/>
+            <w:shd w:fill="FFFFFF" w:val="clear"/>
+            <w:tcMar>
+              <w:top w:type="dxa" w:w="100"/>
+              <w:left w:type="dxa" w:w="120"/>
+              <w:bottom w:type="dxa" w:w="100"/>
+              <w:right w:type="dxa" w:w="120"/>
+            </w:tcMar>
+          </w:tcPr>
+          <w:p>
+            <w:r>
+              <w:rPr>
+                <w:b w:val="false"/>
+                <w:bCs w:val="false"/>
+                <w:color w:val="111827"/>
+                <w:sz w:val="20"/>
+                <w:szCs w:val="20"/>
+              </w:rPr>
+              <w:t xml:space="preserve">Built the buildable half of the owner's web/mobile strategy. (1) Expanded regional food database (~95 foods with carbs, GI, protein, fat across Indian, East/SE Asian, Middle Eastern, Mexican, African, Western cuisines). (2) Meal Glycemic Simulator + Smart Swapper — build a meal, see total glycemic load/carbs/protein/fat, get one-tap lower-GI swaps with % reduction. (3) CGM CSV Visualizer — drag-drop a Dexcom/Libre/Contour export, parsed 100% in-browser (private), shows avg glucose, GMI, time-in-range, and a glucose curve. (4) SEO lead-magnet calculators: Daily Carb &amp; Fiber Target, Post-Meal Glucose Target Finder. (5) App Landing Zone on the homepage — QR code to install, Google Play badge, phone mockups, feature highlights for desktop→mobile conversion. Tools hub now lists 12 tools; sitemap at 36 URLs. NOTE: the web dashboard of mobile logs and caregiver sharing were scoped OUT — they require the Android app to sync data to a shared backend first (an app-dev project, not a website task).</w:t>
+            </w:r>
+          </w:p>
+        </w:tc>
+      </w:tr>
+      <w:tr>
+        <w:tc>
+          <w:tcPr>
+            <w:tcW w:type="dxa" w:w="3200"/>
+            <w:shd w:fill="F8FAFC" w:val="clear"/>
+            <w:tcMar>
+              <w:top w:type="dxa" w:w="100"/>
+              <w:left w:type="dxa" w:w="120"/>
+              <w:bottom w:type="dxa" w:w="100"/>
+              <w:right w:type="dxa" w:w="120"/>
+            </w:tcMar>
+          </w:tcPr>
+          <w:p>
+            <w:r>
+              <w:rPr>
+                <w:b/>
+                <w:bCs/>
+                <w:color w:val="111827"/>
+                <w:sz w:val="20"/>
+                <w:szCs w:val="20"/>
+              </w:rPr>
               <w:t xml:space="preserve">Owner actions</w:t>
             </w:r>
           </w:p>
@@ -768,24 +818,24 @@
         <w:tc>
           <w:tcPr>
             <w:tcW w:type="dxa" w:w="6400"/>
-            <w:shd w:fill="FFFFFF" w:val="clear"/>
-            <w:tcMar>
-              <w:top w:type="dxa" w:w="100"/>
-              <w:left w:type="dxa" w:w="120"/>
-              <w:bottom w:type="dxa" w:w="100"/>
-              <w:right w:type="dxa" w:w="120"/>
-            </w:tcMar>
-          </w:tcPr>
-          <w:p>
-            <w:r>
-              <w:rPr>
-                <w:b w:val="false"/>
-                <w:bCs w:val="false"/>
-                <w:color w:val="111827"/>
-                <w:sz w:val="20"/>
-                <w:szCs w:val="20"/>
-              </w:rPr>
-              <w:t xml:space="preserve">Formspree destination + mailbox for connect@myhealthyglucose.com must be set up separately for contact emails to route. Optional: add VITE_PLAUSIBLE_DOMAIN (+ Plausible account) to turn on analytics. Recommended: legal review of the new Privacy/Terms/Disclaimer pages.</w:t>
+            <w:shd w:fill="F8FAFC" w:val="clear"/>
+            <w:tcMar>
+              <w:top w:type="dxa" w:w="100"/>
+              <w:left w:type="dxa" w:w="120"/>
+              <w:bottom w:type="dxa" w:w="100"/>
+              <w:right w:type="dxa" w:w="120"/>
+            </w:tcMar>
+          </w:tcPr>
+          <w:p>
+            <w:r>
+              <w:rPr>
+                <w:b w:val="false"/>
+                <w:bCs w:val="false"/>
+                <w:color w:val="111827"/>
+                <w:sz w:val="20"/>
+                <w:szCs w:val="20"/>
+              </w:rPr>
+              <w:t xml:space="preserve">Add app screenshots to the landing zone if you want real device shots (currently stylized mockups). The mobile-sync-dependent features (web dashboard, family sharing) need app-side development before the website can surface them.</w:t>
             </w:r>
           </w:p>
         </w:tc>

</xml_diff>

<commit_message>
Real app screenshots + dedicated Features/app-tour page
Real screenshots (9, optimized ~30-75KB each):
- App Landing Zone on homepage now shows real screenshots instead
  of stylized phone mockups

New /features page:
- Full visual app tour through all 9 screens with captions:
  Today dashboard, Food diary, Barcode/label scanning, Medications,
  Preventive care & screenings, Quick care modes & Emergency ID,
  Family & caregivers, Medical profile, and the full menu
- CTAs to Google Play and to /about-app for pricing

Nav: 'The App' relabeled 'Features' -> /features. /about-app still
reachable via footer + CTA on the new page. Sitemap now 37 URLs.

Note: screenshots reveal the app already has Family/Caregiver
sharing and Dexcom CGM built in, so a future web dashboard has more
to build on than initially scoped. Owner handling app.myhealthyglucose.com
separately.
</commit_message>
<xml_diff>
--- a/docs/MyHealthyGlucose_Website_Roadmap.docx
+++ b/docs/MyHealthyGlucose_Website_Roadmap.docx
@@ -811,6 +811,57 @@
                 <w:sz w:val="20"/>
                 <w:szCs w:val="20"/>
               </w:rPr>
+              <w:t xml:space="preserve">Jul 22, 2026 — Real screenshots + Features/app-tour page</w:t>
+            </w:r>
+          </w:p>
+        </w:tc>
+        <w:tc>
+          <w:tcPr>
+            <w:tcW w:type="dxa" w:w="6400"/>
+            <w:shd w:fill="F8FAFC" w:val="clear"/>
+            <w:tcMar>
+              <w:top w:type="dxa" w:w="100"/>
+              <w:left w:type="dxa" w:w="120"/>
+              <w:bottom w:type="dxa" w:w="100"/>
+              <w:right w:type="dxa" w:w="120"/>
+            </w:tcMar>
+          </w:tcPr>
+          <w:p>
+            <w:r>
+              <w:rPr>
+                <w:b w:val="false"/>
+                <w:bCs w:val="false"/>
+                <w:color w:val="111827"/>
+                <w:sz w:val="20"/>
+                <w:szCs w:val="20"/>
+              </w:rPr>
+              <w:t xml:space="preserve">Owner supplied 9 real app screenshots. Processed and added to the site: (1) App Landing Zone on the homepage now shows real screenshots (Today dashboard, Food diary) instead of stylized mockups. (2) New dedicated /features page — a full visual app tour walking through all 9 screens with captions: Today dashboard, Food diary, Barcode/label scanning, Medications, Preventive care &amp; screenings, Quick care modes &amp; Emergency ID, Family &amp; caregivers, Medical profile, and the full menu (Dexcom CGM, multi-profile, lab scanning, reports). Nav 'The App' relabeled 'Features' → /features; existing /about-app (pricing/plans) still reachable via footer and a CTA on the new page. Sitemap now 37 URLs.
+Note from these screenshots: the app already has Family/Caregiver sharing (via share code) and Dexcom CGM integration built in — so the previously-deferred 'web dashboard' and 'family sharing on web' features are more buildable than first scoped, once the owner's separate app.myhealthyglucose.com project exposes that data. Owner is handling that piece separately.</w:t>
+            </w:r>
+          </w:p>
+        </w:tc>
+      </w:tr>
+      <w:tr>
+        <w:tc>
+          <w:tcPr>
+            <w:tcW w:type="dxa" w:w="3200"/>
+            <w:shd w:fill="FFFFFF" w:val="clear"/>
+            <w:tcMar>
+              <w:top w:type="dxa" w:w="100"/>
+              <w:left w:type="dxa" w:w="120"/>
+              <w:bottom w:type="dxa" w:w="100"/>
+              <w:right w:type="dxa" w:w="120"/>
+            </w:tcMar>
+          </w:tcPr>
+          <w:p>
+            <w:r>
+              <w:rPr>
+                <w:b/>
+                <w:bCs/>
+                <w:color w:val="111827"/>
+                <w:sz w:val="20"/>
+                <w:szCs w:val="20"/>
+              </w:rPr>
               <w:t xml:space="preserve">Owner actions</w:t>
             </w:r>
           </w:p>
@@ -818,24 +869,24 @@
         <w:tc>
           <w:tcPr>
             <w:tcW w:type="dxa" w:w="6400"/>
-            <w:shd w:fill="F8FAFC" w:val="clear"/>
-            <w:tcMar>
-              <w:top w:type="dxa" w:w="100"/>
-              <w:left w:type="dxa" w:w="120"/>
-              <w:bottom w:type="dxa" w:w="100"/>
-              <w:right w:type="dxa" w:w="120"/>
-            </w:tcMar>
-          </w:tcPr>
-          <w:p>
-            <w:r>
-              <w:rPr>
-                <w:b w:val="false"/>
-                <w:bCs w:val="false"/>
-                <w:color w:val="111827"/>
-                <w:sz w:val="20"/>
-                <w:szCs w:val="20"/>
-              </w:rPr>
-              <w:t xml:space="preserve">Add app screenshots to the landing zone if you want real device shots (currently stylized mockups). The mobile-sync-dependent features (web dashboard, family sharing) need app-side development before the website can surface them.</w:t>
+            <w:shd w:fill="FFFFFF" w:val="clear"/>
+            <w:tcMar>
+              <w:top w:type="dxa" w:w="100"/>
+              <w:left w:type="dxa" w:w="120"/>
+              <w:bottom w:type="dxa" w:w="100"/>
+              <w:right w:type="dxa" w:w="120"/>
+            </w:tcMar>
+          </w:tcPr>
+          <w:p>
+            <w:r>
+              <w:rPr>
+                <w:b w:val="false"/>
+                <w:bCs w:val="false"/>
+                <w:color w:val="111827"/>
+                <w:sz w:val="20"/>
+                <w:szCs w:val="20"/>
+              </w:rPr>
+              <w:t xml:space="preserve">None required — this batch is fully self-contained. When ready for app.myhealthyglucose.com, the mobile app already has the sync/sharing primitives (family codes, CGM) that a web dashboard would read from.</w:t>
             </w:r>
           </w:p>
         </w:tc>

</xml_diff>